<commit_message>
team 1 job posting EIT - post management & validation
</commit_message>
<xml_diff>
--- a/03_Team_Work/Team1/Milestone_3_Components/1_In_Progress/DC_M3_Team1_EIT_JobPostingService_v1.0.docx
+++ b/03_Team_Work/Team1/Milestone_3_Components/1_In_Progress/DC_M3_Team1_EIT_JobPostingService_v1.0.docx
@@ -1345,9 +1345,38 @@
             <w:pPr>
               <w:rPr>
                 <w:rFonts w:eastAsia="Times New Roman" w:cs="Arial"/>
-                <w:lang w:eastAsia="en-US"/>
-              </w:rPr>
-            </w:pPr>
+                <w:b/>
+                <w:bCs/>
+                <w:lang w:eastAsia="en-US"/>
+              </w:rPr>
+            </w:pPr>
+            <w:r>
+              <w:rPr>
+                <w:rFonts w:eastAsia="Times New Roman" w:cs="Arial"/>
+                <w:b/>
+                <w:bCs/>
+                <w:lang w:eastAsia="en-US"/>
+              </w:rPr>
+              <w:t>Post</w:t>
+            </w:r>
+            <w:r>
+              <w:rPr>
+                <w:rFonts w:eastAsia="Times New Roman" w:cs="Arial"/>
+                <w:b/>
+                <w:bCs/>
+                <w:lang w:eastAsia="en-US"/>
+              </w:rPr>
+              <w:t xml:space="preserve"> </w:t>
+            </w:r>
+            <w:r>
+              <w:rPr>
+                <w:rFonts w:eastAsia="Times New Roman" w:cs="Arial"/>
+                <w:b/>
+                <w:bCs/>
+                <w:lang w:eastAsia="en-US"/>
+              </w:rPr>
+              <w:t>Editor</w:t>
+            </w:r>
           </w:p>
         </w:tc>
         <w:tc>
@@ -1362,6 +1391,13 @@
                 <w:lang w:eastAsia="en-US"/>
               </w:rPr>
             </w:pPr>
+            <w:r>
+              <w:rPr>
+                <w:rFonts w:eastAsia="Times New Roman" w:cs="Arial"/>
+                <w:lang w:eastAsia="en-US"/>
+              </w:rPr>
+              <w:t>JobPosting</w:t>
+            </w:r>
           </w:p>
         </w:tc>
         <w:tc>
@@ -1376,6 +1412,13 @@
                 <w:lang w:eastAsia="en-US"/>
               </w:rPr>
             </w:pPr>
+            <w:r>
+              <w:rPr>
+                <w:rFonts w:eastAsia="Times New Roman" w:cs="Arial"/>
+                <w:lang w:eastAsia="en-US"/>
+              </w:rPr>
+              <w:t>Class</w:t>
+            </w:r>
           </w:p>
         </w:tc>
         <w:tc>
@@ -1390,6 +1433,13 @@
                 <w:lang w:eastAsia="en-US"/>
               </w:rPr>
             </w:pPr>
+            <w:r>
+              <w:rPr>
+                <w:rFonts w:eastAsia="Times New Roman" w:cs="Arial"/>
+                <w:lang w:eastAsia="en-US"/>
+              </w:rPr>
+              <w:t>Job data</w:t>
+            </w:r>
           </w:p>
         </w:tc>
         <w:tc>
@@ -1418,6 +1468,13 @@
                 <w:lang w:eastAsia="en-US"/>
               </w:rPr>
             </w:pPr>
+            <w:r>
+              <w:rPr>
+                <w:rFonts w:eastAsia="Times New Roman" w:cs="Times New Roman"/>
+                <w:lang w:eastAsia="en-US"/>
+              </w:rPr>
+              <w:t>currentPost, JobPostingsTable</w:t>
+            </w:r>
           </w:p>
         </w:tc>
       </w:tr>
@@ -1433,6 +1490,15 @@
                 <w:lang w:eastAsia="en-US"/>
               </w:rPr>
             </w:pPr>
+            <w:r>
+              <w:rPr>
+                <w:rFonts w:eastAsia="Times New Roman" w:cs="Arial"/>
+                <w:b/>
+                <w:bCs/>
+                <w:lang w:eastAsia="en-US"/>
+              </w:rPr>
+              <w:t>Post Editor</w:t>
+            </w:r>
           </w:p>
         </w:tc>
         <w:tc>
@@ -1446,6 +1512,13 @@
                 <w:lang w:eastAsia="en-US"/>
               </w:rPr>
             </w:pPr>
+            <w:r>
+              <w:rPr>
+                <w:rFonts w:eastAsia="Times New Roman" w:cs="Arial"/>
+                <w:lang w:eastAsia="en-US"/>
+              </w:rPr>
+              <w:t>currentPost</w:t>
+            </w:r>
           </w:p>
         </w:tc>
         <w:tc>
@@ -1459,6 +1532,13 @@
                 <w:lang w:eastAsia="en-US"/>
               </w:rPr>
             </w:pPr>
+            <w:r>
+              <w:rPr>
+                <w:rFonts w:eastAsia="Times New Roman" w:cs="Arial"/>
+                <w:lang w:eastAsia="en-US"/>
+              </w:rPr>
+              <w:t>Object</w:t>
+            </w:r>
           </w:p>
         </w:tc>
         <w:tc>
@@ -1472,6 +1552,13 @@
                 <w:lang w:eastAsia="en-US"/>
               </w:rPr>
             </w:pPr>
+            <w:r>
+              <w:rPr>
+                <w:rFonts w:eastAsia="Times New Roman" w:cs="Arial"/>
+                <w:lang w:eastAsia="en-US"/>
+              </w:rPr>
+              <w:t>The active job post is being modified by the recruiter</w:t>
+            </w:r>
           </w:p>
         </w:tc>
         <w:tc>
@@ -1498,6 +1585,13 @@
                 <w:lang w:eastAsia="en-US"/>
               </w:rPr>
             </w:pPr>
+            <w:r>
+              <w:rPr>
+                <w:rFonts w:eastAsia="Times New Roman" w:cs="Times New Roman"/>
+                <w:lang w:eastAsia="en-US"/>
+              </w:rPr>
+              <w:t>JobPosting, updatePostDetails</w:t>
+            </w:r>
           </w:p>
         </w:tc>
       </w:tr>
@@ -1514,6 +1608,15 @@
                 <w:lang w:eastAsia="en-US"/>
               </w:rPr>
             </w:pPr>
+            <w:r>
+              <w:rPr>
+                <w:rFonts w:eastAsia="Times New Roman" w:cs="Arial"/>
+                <w:b/>
+                <w:bCs/>
+                <w:lang w:eastAsia="en-US"/>
+              </w:rPr>
+              <w:t>Post Editor</w:t>
+            </w:r>
           </w:p>
         </w:tc>
         <w:tc>
@@ -1528,6 +1631,13 @@
                 <w:lang w:eastAsia="en-US"/>
               </w:rPr>
             </w:pPr>
+            <w:r>
+              <w:rPr>
+                <w:rFonts w:eastAsia="Times New Roman" w:cs="Arial"/>
+                <w:lang w:eastAsia="en-US"/>
+              </w:rPr>
+              <w:t>createPost</w:t>
+            </w:r>
           </w:p>
         </w:tc>
         <w:tc>
@@ -1542,6 +1652,13 @@
                 <w:lang w:eastAsia="en-US"/>
               </w:rPr>
             </w:pPr>
+            <w:r>
+              <w:rPr>
+                <w:rFonts w:eastAsia="Times New Roman" w:cs="Arial"/>
+                <w:lang w:eastAsia="en-US"/>
+              </w:rPr>
+              <w:t>Method</w:t>
+            </w:r>
           </w:p>
         </w:tc>
         <w:tc>
@@ -1556,6 +1673,13 @@
                 <w:lang w:eastAsia="en-US"/>
               </w:rPr>
             </w:pPr>
+            <w:r>
+              <w:rPr>
+                <w:rFonts w:eastAsia="Times New Roman" w:cs="Arial"/>
+                <w:lang w:eastAsia="en-US"/>
+              </w:rPr>
+              <w:t>Initiate a new JobPosting object</w:t>
+            </w:r>
           </w:p>
         </w:tc>
         <w:tc>
@@ -1584,6 +1708,13 @@
                 <w:lang w:eastAsia="en-US"/>
               </w:rPr>
             </w:pPr>
+            <w:r>
+              <w:rPr>
+                <w:rFonts w:eastAsia="Times New Roman" w:cs="Times New Roman"/>
+                <w:lang w:eastAsia="en-US"/>
+              </w:rPr>
+              <w:t>JobPosting, JobPostingsTable</w:t>
+            </w:r>
           </w:p>
         </w:tc>
       </w:tr>
@@ -1599,6 +1730,15 @@
                 <w:lang w:eastAsia="en-US"/>
               </w:rPr>
             </w:pPr>
+            <w:r>
+              <w:rPr>
+                <w:rFonts w:eastAsia="Times New Roman" w:cs="Arial"/>
+                <w:b/>
+                <w:bCs/>
+                <w:lang w:eastAsia="en-US"/>
+              </w:rPr>
+              <w:t>Post Editor</w:t>
+            </w:r>
           </w:p>
         </w:tc>
         <w:tc>
@@ -1612,6 +1752,13 @@
                 <w:lang w:eastAsia="en-US"/>
               </w:rPr>
             </w:pPr>
+            <w:r>
+              <w:rPr>
+                <w:rFonts w:eastAsia="Times New Roman" w:cs="Arial"/>
+                <w:lang w:eastAsia="en-US"/>
+              </w:rPr>
+              <w:t>updatePostDetails</w:t>
+            </w:r>
           </w:p>
         </w:tc>
         <w:tc>
@@ -1625,6 +1772,13 @@
                 <w:lang w:eastAsia="en-US"/>
               </w:rPr>
             </w:pPr>
+            <w:r>
+              <w:rPr>
+                <w:rFonts w:eastAsia="Times New Roman" w:cs="Arial"/>
+                <w:lang w:eastAsia="en-US"/>
+              </w:rPr>
+              <w:t>Method</w:t>
+            </w:r>
           </w:p>
         </w:tc>
         <w:tc>
@@ -1638,6 +1792,13 @@
                 <w:lang w:eastAsia="en-US"/>
               </w:rPr>
             </w:pPr>
+            <w:r>
+              <w:rPr>
+                <w:rFonts w:eastAsia="Times New Roman" w:cs="Arial"/>
+                <w:lang w:eastAsia="en-US"/>
+              </w:rPr>
+              <w:t>Modifies the job data</w:t>
+            </w:r>
           </w:p>
         </w:tc>
         <w:tc>
@@ -1664,6 +1825,13 @@
                 <w:lang w:eastAsia="en-US"/>
               </w:rPr>
             </w:pPr>
+            <w:r>
+              <w:rPr>
+                <w:rFonts w:eastAsia="Times New Roman" w:cs="Times New Roman"/>
+                <w:lang w:eastAsia="en-US"/>
+              </w:rPr>
+              <w:t>currentPost, JobPostingTable</w:t>
+            </w:r>
           </w:p>
         </w:tc>
       </w:tr>
@@ -1680,6 +1848,15 @@
                 <w:lang w:eastAsia="en-US"/>
               </w:rPr>
             </w:pPr>
+            <w:r>
+              <w:rPr>
+                <w:rFonts w:eastAsia="Times New Roman" w:cs="Arial"/>
+                <w:b/>
+                <w:bCs/>
+                <w:lang w:eastAsia="en-US"/>
+              </w:rPr>
+              <w:t>Post Editor</w:t>
+            </w:r>
           </w:p>
         </w:tc>
         <w:tc>
@@ -1694,6 +1871,13 @@
                 <w:lang w:eastAsia="en-US"/>
               </w:rPr>
             </w:pPr>
+            <w:r>
+              <w:rPr>
+                <w:rFonts w:eastAsia="Times New Roman" w:cs="Arial"/>
+                <w:lang w:eastAsia="en-US"/>
+              </w:rPr>
+              <w:t>archivePost</w:t>
+            </w:r>
           </w:p>
         </w:tc>
         <w:tc>
@@ -1708,6 +1892,13 @@
                 <w:lang w:eastAsia="en-US"/>
               </w:rPr>
             </w:pPr>
+            <w:r>
+              <w:rPr>
+                <w:rFonts w:eastAsia="Times New Roman" w:cs="Arial"/>
+                <w:lang w:eastAsia="en-US"/>
+              </w:rPr>
+              <w:t>Method</w:t>
+            </w:r>
           </w:p>
         </w:tc>
         <w:tc>
@@ -1722,6 +1913,13 @@
                 <w:lang w:eastAsia="en-US"/>
               </w:rPr>
             </w:pPr>
+            <w:r>
+              <w:rPr>
+                <w:rFonts w:eastAsia="Times New Roman" w:cs="Arial"/>
+                <w:lang w:eastAsia="en-US"/>
+              </w:rPr>
+              <w:t>Hide the post from student searches</w:t>
+            </w:r>
           </w:p>
         </w:tc>
         <w:tc>
@@ -1750,6 +1948,13 @@
                 <w:lang w:eastAsia="en-US"/>
               </w:rPr>
             </w:pPr>
+            <w:r>
+              <w:rPr>
+                <w:rFonts w:eastAsia="Times New Roman" w:cs="Times New Roman"/>
+                <w:lang w:eastAsia="en-US"/>
+              </w:rPr>
+              <w:t>currentPost, JobPostingsTable</w:t>
+            </w:r>
           </w:p>
         </w:tc>
       </w:tr>
@@ -1765,6 +1970,15 @@
                 <w:lang w:eastAsia="en-US"/>
               </w:rPr>
             </w:pPr>
+            <w:r>
+              <w:rPr>
+                <w:rFonts w:eastAsia="Times New Roman" w:cs="Arial"/>
+                <w:b/>
+                <w:bCs/>
+                <w:lang w:eastAsia="en-US"/>
+              </w:rPr>
+              <w:t>Post Editor</w:t>
+            </w:r>
           </w:p>
         </w:tc>
         <w:tc>
@@ -1778,6 +1992,13 @@
                 <w:lang w:eastAsia="en-US"/>
               </w:rPr>
             </w:pPr>
+            <w:r>
+              <w:rPr>
+                <w:rFonts w:eastAsia="Times New Roman" w:cs="Arial"/>
+                <w:lang w:eastAsia="en-US"/>
+              </w:rPr>
+              <w:t>isDraft</w:t>
+            </w:r>
           </w:p>
         </w:tc>
         <w:tc>
@@ -1791,6 +2012,13 @@
                 <w:lang w:eastAsia="en-US"/>
               </w:rPr>
             </w:pPr>
+            <w:r>
+              <w:rPr>
+                <w:rFonts w:eastAsia="Times New Roman" w:cs="Arial"/>
+                <w:lang w:eastAsia="en-US"/>
+              </w:rPr>
+              <w:t>Variable</w:t>
+            </w:r>
           </w:p>
         </w:tc>
         <w:tc>
@@ -1804,6 +2032,13 @@
                 <w:lang w:eastAsia="en-US"/>
               </w:rPr>
             </w:pPr>
+            <w:r>
+              <w:rPr>
+                <w:rFonts w:eastAsia="Times New Roman" w:cs="Arial"/>
+                <w:lang w:eastAsia="en-US"/>
+              </w:rPr>
+              <w:t>A boolean indicating if the job post is still a hidden draft</w:t>
+            </w:r>
           </w:p>
         </w:tc>
         <w:tc>
@@ -1830,6 +2065,13 @@
                 <w:lang w:eastAsia="en-US"/>
               </w:rPr>
             </w:pPr>
+            <w:r>
+              <w:rPr>
+                <w:rFonts w:eastAsia="Times New Roman" w:cs="Times New Roman"/>
+                <w:lang w:eastAsia="en-US"/>
+              </w:rPr>
+              <w:t>JobPosting, createPost</w:t>
+            </w:r>
           </w:p>
         </w:tc>
       </w:tr>
@@ -1846,6 +2088,15 @@
                 <w:lang w:eastAsia="en-US"/>
               </w:rPr>
             </w:pPr>
+            <w:r>
+              <w:rPr>
+                <w:rFonts w:eastAsia="Times New Roman" w:cs="Arial"/>
+                <w:b/>
+                <w:bCs/>
+                <w:lang w:eastAsia="en-US"/>
+              </w:rPr>
+              <w:t>Post Editor</w:t>
+            </w:r>
           </w:p>
         </w:tc>
         <w:tc>
@@ -1860,6 +2111,13 @@
                 <w:lang w:eastAsia="en-US"/>
               </w:rPr>
             </w:pPr>
+            <w:r>
+              <w:rPr>
+                <w:rFonts w:eastAsia="Times New Roman" w:cs="Arial"/>
+                <w:lang w:eastAsia="en-US"/>
+              </w:rPr>
+              <w:t>authorId</w:t>
+            </w:r>
           </w:p>
         </w:tc>
         <w:tc>
@@ -1874,6 +2132,13 @@
                 <w:lang w:eastAsia="en-US"/>
               </w:rPr>
             </w:pPr>
+            <w:r>
+              <w:rPr>
+                <w:rFonts w:eastAsia="Times New Roman" w:cs="Arial"/>
+                <w:lang w:eastAsia="en-US"/>
+              </w:rPr>
+              <w:t>Variable</w:t>
+            </w:r>
           </w:p>
         </w:tc>
         <w:tc>
@@ -1888,6 +2153,13 @@
                 <w:lang w:eastAsia="en-US"/>
               </w:rPr>
             </w:pPr>
+            <w:r>
+              <w:rPr>
+                <w:rFonts w:eastAsia="Times New Roman" w:cs="Arial"/>
+                <w:lang w:eastAsia="en-US"/>
+              </w:rPr>
+              <w:t>Identifier of the recruiter</w:t>
+            </w:r>
           </w:p>
         </w:tc>
         <w:tc>
@@ -1916,6 +2188,13 @@
                 <w:lang w:eastAsia="en-US"/>
               </w:rPr>
             </w:pPr>
+            <w:r>
+              <w:rPr>
+                <w:rFonts w:eastAsia="Times New Roman" w:cs="Times New Roman"/>
+                <w:lang w:eastAsia="en-US"/>
+              </w:rPr>
+              <w:t>JobPosting</w:t>
+            </w:r>
           </w:p>
         </w:tc>
       </w:tr>
@@ -1931,6 +2210,15 @@
                 <w:lang w:eastAsia="en-US"/>
               </w:rPr>
             </w:pPr>
+            <w:r>
+              <w:rPr>
+                <w:rFonts w:eastAsia="Times New Roman" w:cs="Arial"/>
+                <w:b/>
+                <w:bCs/>
+                <w:lang w:eastAsia="en-US"/>
+              </w:rPr>
+              <w:t>Post Editor</w:t>
+            </w:r>
           </w:p>
         </w:tc>
         <w:tc>
@@ -1944,6 +2232,13 @@
                 <w:lang w:eastAsia="en-US"/>
               </w:rPr>
             </w:pPr>
+            <w:r>
+              <w:rPr>
+                <w:rFonts w:eastAsia="Times New Roman" w:cs="Arial"/>
+                <w:lang w:eastAsia="en-US"/>
+              </w:rPr>
+              <w:t>JobPostinsTable</w:t>
+            </w:r>
           </w:p>
         </w:tc>
         <w:tc>
@@ -1957,6 +2252,13 @@
                 <w:lang w:eastAsia="en-US"/>
               </w:rPr>
             </w:pPr>
+            <w:r>
+              <w:rPr>
+                <w:rFonts w:eastAsia="Times New Roman" w:cs="Arial"/>
+                <w:lang w:eastAsia="en-US"/>
+              </w:rPr>
+              <w:t>Data Store</w:t>
+            </w:r>
           </w:p>
         </w:tc>
         <w:tc>
@@ -1970,6 +2272,13 @@
                 <w:lang w:eastAsia="en-US"/>
               </w:rPr>
             </w:pPr>
+            <w:r>
+              <w:rPr>
+                <w:rFonts w:eastAsia="Times New Roman" w:cs="Arial"/>
+                <w:lang w:eastAsia="en-US"/>
+              </w:rPr>
+              <w:t>The database table that stores all job records</w:t>
+            </w:r>
           </w:p>
         </w:tc>
         <w:tc>
@@ -1996,92 +2305,13 @@
                 <w:lang w:eastAsia="en-US"/>
               </w:rPr>
             </w:pPr>
-          </w:p>
-        </w:tc>
-      </w:tr>
-      <w:tr>
-        <w:tc>
-          <w:tcPr>
-            <w:tcW w:w="1290" w:type="dxa"/>
-            <w:shd w:val="clear" w:color="auto" w:fill="CCCCCC" w:themeFill="text1" w:themeFillTint="33"/>
-          </w:tcPr>
-          <w:p>
-            <w:pPr>
-              <w:rPr>
-                <w:rFonts w:eastAsia="Times New Roman" w:cs="Arial"/>
-                <w:lang w:eastAsia="en-US"/>
-              </w:rPr>
-            </w:pPr>
-          </w:p>
-        </w:tc>
-        <w:tc>
-          <w:tcPr>
-            <w:tcW w:w="1903" w:type="dxa"/>
-            <w:shd w:val="clear" w:color="auto" w:fill="CCCCCC" w:themeFill="text1" w:themeFillTint="33"/>
-          </w:tcPr>
-          <w:p>
-            <w:pPr>
-              <w:rPr>
-                <w:rFonts w:eastAsia="Times New Roman" w:cs="Arial"/>
-                <w:lang w:eastAsia="en-US"/>
-              </w:rPr>
-            </w:pPr>
-          </w:p>
-        </w:tc>
-        <w:tc>
-          <w:tcPr>
-            <w:tcW w:w="1133" w:type="dxa"/>
-            <w:shd w:val="clear" w:color="auto" w:fill="CCCCCC" w:themeFill="text1" w:themeFillTint="33"/>
-          </w:tcPr>
-          <w:p>
-            <w:pPr>
-              <w:rPr>
-                <w:rFonts w:eastAsia="Times New Roman" w:cs="Arial"/>
-                <w:lang w:eastAsia="en-US"/>
-              </w:rPr>
-            </w:pPr>
-          </w:p>
-        </w:tc>
-        <w:tc>
-          <w:tcPr>
-            <w:tcW w:w="1979" w:type="dxa"/>
-            <w:shd w:val="clear" w:color="auto" w:fill="CCCCCC" w:themeFill="text1" w:themeFillTint="33"/>
-          </w:tcPr>
-          <w:p>
-            <w:pPr>
-              <w:rPr>
-                <w:rFonts w:eastAsia="Times New Roman" w:cs="Arial"/>
-                <w:lang w:eastAsia="en-US"/>
-              </w:rPr>
-            </w:pPr>
-          </w:p>
-        </w:tc>
-        <w:tc>
-          <w:tcPr>
-            <w:tcW w:w="885" w:type="dxa"/>
-            <w:shd w:val="clear" w:color="auto" w:fill="CCCCCC" w:themeFill="text1" w:themeFillTint="33"/>
-          </w:tcPr>
-          <w:p>
-            <w:pPr>
-              <w:rPr>
-                <w:rFonts w:eastAsia="Times New Roman" w:cs="Times New Roman"/>
-                <w:lang w:eastAsia="en-US"/>
-              </w:rPr>
-            </w:pPr>
-          </w:p>
-        </w:tc>
-        <w:tc>
-          <w:tcPr>
-            <w:tcW w:w="2160" w:type="dxa"/>
-            <w:shd w:val="clear" w:color="auto" w:fill="CCCCCC" w:themeFill="text1" w:themeFillTint="33"/>
-          </w:tcPr>
-          <w:p>
-            <w:pPr>
-              <w:rPr>
-                <w:rFonts w:eastAsia="Times New Roman" w:cs="Times New Roman"/>
-                <w:lang w:eastAsia="en-US"/>
-              </w:rPr>
-            </w:pPr>
+            <w:r>
+              <w:rPr>
+                <w:rFonts w:eastAsia="Times New Roman" w:cs="Times New Roman"/>
+                <w:lang w:eastAsia="en-US"/>
+              </w:rPr>
+              <w:t>JobPosting, createPost, updatePostDetails</w:t>
+            </w:r>
           </w:p>
         </w:tc>
       </w:tr>
@@ -2375,9 +2605,20 @@
             <w:pPr>
               <w:rPr>
                 <w:rFonts w:eastAsia="Times New Roman" w:cs="Arial"/>
-                <w:lang w:eastAsia="en-US"/>
-              </w:rPr>
-            </w:pPr>
+                <w:b/>
+                <w:bCs/>
+                <w:lang w:eastAsia="en-US"/>
+              </w:rPr>
+            </w:pPr>
+            <w:r>
+              <w:rPr>
+                <w:rFonts w:eastAsia="Times New Roman" w:cs="Arial"/>
+                <w:b/>
+                <w:bCs/>
+                <w:lang w:eastAsia="en-US"/>
+              </w:rPr>
+              <w:t>Post Validator</w:t>
+            </w:r>
           </w:p>
         </w:tc>
         <w:tc>
@@ -2392,6 +2633,13 @@
                 <w:lang w:eastAsia="en-US"/>
               </w:rPr>
             </w:pPr>
+            <w:r>
+              <w:rPr>
+                <w:rFonts w:eastAsia="Times New Roman" w:cs="Arial"/>
+                <w:lang w:eastAsia="en-US"/>
+              </w:rPr>
+              <w:t>PostValidator</w:t>
+            </w:r>
           </w:p>
         </w:tc>
         <w:tc>
@@ -2406,6 +2654,13 @@
                 <w:lang w:eastAsia="en-US"/>
               </w:rPr>
             </w:pPr>
+            <w:r>
+              <w:rPr>
+                <w:rFonts w:eastAsia="Times New Roman" w:cs="Arial"/>
+                <w:lang w:eastAsia="en-US"/>
+              </w:rPr>
+              <w:t>Class</w:t>
+            </w:r>
           </w:p>
         </w:tc>
         <w:tc>
@@ -2420,6 +2675,13 @@
                 <w:lang w:eastAsia="en-US"/>
               </w:rPr>
             </w:pPr>
+            <w:r>
+              <w:rPr>
+                <w:rFonts w:eastAsia="Times New Roman" w:cs="Arial"/>
+                <w:lang w:eastAsia="en-US"/>
+              </w:rPr>
+              <w:t>Contains the core logic algortithms used to validate the job post</w:t>
+            </w:r>
           </w:p>
         </w:tc>
         <w:tc>
@@ -2448,6 +2710,13 @@
                 <w:lang w:eastAsia="en-US"/>
               </w:rPr>
             </w:pPr>
+            <w:r>
+              <w:rPr>
+                <w:rFonts w:eastAsia="Times New Roman" w:cs="Times New Roman"/>
+                <w:lang w:eastAsia="en-US"/>
+              </w:rPr>
+              <w:t>ValidationResult, validateRequiredFields</w:t>
+            </w:r>
           </w:p>
         </w:tc>
       </w:tr>
@@ -2460,9 +2729,20 @@
             <w:pPr>
               <w:rPr>
                 <w:rFonts w:eastAsia="Times New Roman" w:cs="Arial"/>
-                <w:lang w:eastAsia="en-US"/>
-              </w:rPr>
-            </w:pPr>
+                <w:b/>
+                <w:bCs/>
+                <w:lang w:eastAsia="en-US"/>
+              </w:rPr>
+            </w:pPr>
+            <w:r>
+              <w:rPr>
+                <w:rFonts w:eastAsia="Times New Roman" w:cs="Arial"/>
+                <w:b/>
+                <w:bCs/>
+                <w:lang w:eastAsia="en-US"/>
+              </w:rPr>
+              <w:t>Post Validator</w:t>
+            </w:r>
           </w:p>
         </w:tc>
         <w:tc>
@@ -2476,6 +2756,13 @@
                 <w:lang w:eastAsia="en-US"/>
               </w:rPr>
             </w:pPr>
+            <w:r>
+              <w:rPr>
+                <w:rFonts w:eastAsia="Times New Roman" w:cs="Arial"/>
+                <w:lang w:eastAsia="en-US"/>
+              </w:rPr>
+              <w:t>ValidationResult</w:t>
+            </w:r>
           </w:p>
         </w:tc>
         <w:tc>
@@ -2489,6 +2776,13 @@
                 <w:lang w:eastAsia="en-US"/>
               </w:rPr>
             </w:pPr>
+            <w:r>
+              <w:rPr>
+                <w:rFonts w:eastAsia="Times New Roman" w:cs="Arial"/>
+                <w:lang w:eastAsia="en-US"/>
+              </w:rPr>
+              <w:t>Object</w:t>
+            </w:r>
           </w:p>
         </w:tc>
         <w:tc>
@@ -2502,6 +2796,13 @@
                 <w:lang w:eastAsia="en-US"/>
               </w:rPr>
             </w:pPr>
+            <w:r>
+              <w:rPr>
+                <w:rFonts w:eastAsia="Times New Roman" w:cs="Arial"/>
+                <w:lang w:eastAsia="en-US"/>
+              </w:rPr>
+              <w:t>Stores the pass/fail breakdown of a completed validation check</w:t>
+            </w:r>
           </w:p>
         </w:tc>
         <w:tc>
@@ -2528,6 +2829,13 @@
                 <w:lang w:eastAsia="en-US"/>
               </w:rPr>
             </w:pPr>
+            <w:r>
+              <w:rPr>
+                <w:rFonts w:eastAsia="Times New Roman" w:cs="Times New Roman"/>
+                <w:lang w:eastAsia="en-US"/>
+              </w:rPr>
+              <w:t>PostValidator, isValid, errorMessage</w:t>
+            </w:r>
           </w:p>
         </w:tc>
       </w:tr>
@@ -2541,9 +2849,20 @@
             <w:pPr>
               <w:rPr>
                 <w:rFonts w:eastAsia="Times New Roman" w:cs="Arial"/>
-                <w:lang w:eastAsia="en-US"/>
-              </w:rPr>
-            </w:pPr>
+                <w:b/>
+                <w:bCs/>
+                <w:lang w:eastAsia="en-US"/>
+              </w:rPr>
+            </w:pPr>
+            <w:r>
+              <w:rPr>
+                <w:rFonts w:eastAsia="Times New Roman" w:cs="Arial"/>
+                <w:b/>
+                <w:bCs/>
+                <w:lang w:eastAsia="en-US"/>
+              </w:rPr>
+              <w:t>Post Validator</w:t>
+            </w:r>
           </w:p>
         </w:tc>
         <w:tc>
@@ -2558,6 +2877,13 @@
                 <w:lang w:eastAsia="en-US"/>
               </w:rPr>
             </w:pPr>
+            <w:r>
+              <w:rPr>
+                <w:rFonts w:eastAsia="Times New Roman" w:cs="Arial"/>
+                <w:lang w:eastAsia="en-US"/>
+              </w:rPr>
+              <w:t>validateRequiredFields</w:t>
+            </w:r>
           </w:p>
         </w:tc>
         <w:tc>
@@ -2572,6 +2898,13 @@
                 <w:lang w:eastAsia="en-US"/>
               </w:rPr>
             </w:pPr>
+            <w:r>
+              <w:rPr>
+                <w:rFonts w:eastAsia="Times New Roman" w:cs="Arial"/>
+                <w:lang w:eastAsia="en-US"/>
+              </w:rPr>
+              <w:t>Method</w:t>
+            </w:r>
           </w:p>
         </w:tc>
         <w:tc>
@@ -2586,6 +2919,13 @@
                 <w:lang w:eastAsia="en-US"/>
               </w:rPr>
             </w:pPr>
+            <w:r>
+              <w:rPr>
+                <w:rFonts w:eastAsia="Times New Roman" w:cs="Arial"/>
+                <w:lang w:eastAsia="en-US"/>
+              </w:rPr>
+              <w:t>Check if any required fields are empty</w:t>
+            </w:r>
           </w:p>
         </w:tc>
         <w:tc>
@@ -2614,6 +2954,13 @@
                 <w:lang w:eastAsia="en-US"/>
               </w:rPr>
             </w:pPr>
+            <w:r>
+              <w:rPr>
+                <w:rFonts w:eastAsia="Times New Roman" w:cs="Times New Roman"/>
+                <w:lang w:eastAsia="en-US"/>
+              </w:rPr>
+              <w:t>PostValidator, isValid</w:t>
+            </w:r>
           </w:p>
         </w:tc>
       </w:tr>
@@ -2626,9 +2973,20 @@
             <w:pPr>
               <w:rPr>
                 <w:rFonts w:eastAsia="Times New Roman" w:cs="Arial"/>
-                <w:lang w:eastAsia="en-US"/>
-              </w:rPr>
-            </w:pPr>
+                <w:b/>
+                <w:bCs/>
+                <w:lang w:eastAsia="en-US"/>
+              </w:rPr>
+            </w:pPr>
+            <w:r>
+              <w:rPr>
+                <w:rFonts w:eastAsia="Times New Roman" w:cs="Arial"/>
+                <w:b/>
+                <w:bCs/>
+                <w:lang w:eastAsia="en-US"/>
+              </w:rPr>
+              <w:t>Post Validator</w:t>
+            </w:r>
           </w:p>
         </w:tc>
         <w:tc>
@@ -2642,6 +3000,13 @@
                 <w:lang w:eastAsia="en-US"/>
               </w:rPr>
             </w:pPr>
+            <w:r>
+              <w:rPr>
+                <w:rFonts w:eastAsia="Times New Roman" w:cs="Arial"/>
+                <w:lang w:eastAsia="en-US"/>
+              </w:rPr>
+              <w:t>verifyExpirationDate</w:t>
+            </w:r>
           </w:p>
         </w:tc>
         <w:tc>
@@ -2655,6 +3020,13 @@
                 <w:lang w:eastAsia="en-US"/>
               </w:rPr>
             </w:pPr>
+            <w:r>
+              <w:rPr>
+                <w:rFonts w:eastAsia="Times New Roman" w:cs="Arial"/>
+                <w:lang w:eastAsia="en-US"/>
+              </w:rPr>
+              <w:t>Method</w:t>
+            </w:r>
           </w:p>
         </w:tc>
         <w:tc>
@@ -2668,6 +3040,13 @@
                 <w:lang w:eastAsia="en-US"/>
               </w:rPr>
             </w:pPr>
+            <w:r>
+              <w:rPr>
+                <w:rFonts w:eastAsia="Times New Roman" w:cs="Arial"/>
+                <w:lang w:eastAsia="en-US"/>
+              </w:rPr>
+              <w:t>Confirms that the job post is still in a valid posting timeline</w:t>
+            </w:r>
           </w:p>
         </w:tc>
         <w:tc>
@@ -2694,6 +3073,13 @@
                 <w:lang w:eastAsia="en-US"/>
               </w:rPr>
             </w:pPr>
+            <w:r>
+              <w:rPr>
+                <w:rFonts w:eastAsia="Times New Roman" w:cs="Times New Roman"/>
+                <w:lang w:eastAsia="en-US"/>
+              </w:rPr>
+              <w:t>PostValidator, isValid</w:t>
+            </w:r>
           </w:p>
         </w:tc>
       </w:tr>
@@ -2707,9 +3093,20 @@
             <w:pPr>
               <w:rPr>
                 <w:rFonts w:eastAsia="Times New Roman" w:cs="Arial"/>
-                <w:lang w:eastAsia="en-US"/>
-              </w:rPr>
-            </w:pPr>
+                <w:b/>
+                <w:bCs/>
+                <w:lang w:eastAsia="en-US"/>
+              </w:rPr>
+            </w:pPr>
+            <w:r>
+              <w:rPr>
+                <w:rFonts w:eastAsia="Times New Roman" w:cs="Arial"/>
+                <w:b/>
+                <w:bCs/>
+                <w:lang w:eastAsia="en-US"/>
+              </w:rPr>
+              <w:t>Post Validator</w:t>
+            </w:r>
           </w:p>
         </w:tc>
         <w:tc>
@@ -2724,6 +3121,13 @@
                 <w:lang w:eastAsia="en-US"/>
               </w:rPr>
             </w:pPr>
+            <w:r>
+              <w:rPr>
+                <w:rFonts w:eastAsia="Times New Roman" w:cs="Arial"/>
+                <w:lang w:eastAsia="en-US"/>
+              </w:rPr>
+              <w:t>checkProfanity</w:t>
+            </w:r>
           </w:p>
         </w:tc>
         <w:tc>
@@ -2738,6 +3142,13 @@
                 <w:lang w:eastAsia="en-US"/>
               </w:rPr>
             </w:pPr>
+            <w:r>
+              <w:rPr>
+                <w:rFonts w:eastAsia="Times New Roman" w:cs="Arial"/>
+                <w:lang w:eastAsia="en-US"/>
+              </w:rPr>
+              <w:t>Method</w:t>
+            </w:r>
           </w:p>
         </w:tc>
         <w:tc>
@@ -2752,6 +3163,13 @@
                 <w:lang w:eastAsia="en-US"/>
               </w:rPr>
             </w:pPr>
+            <w:r>
+              <w:rPr>
+                <w:rFonts w:eastAsia="Times New Roman" w:cs="Arial"/>
+                <w:lang w:eastAsia="en-US"/>
+              </w:rPr>
+              <w:t>Evaluates text strings if there is any forbidden term and/or inappropriate content</w:t>
+            </w:r>
           </w:p>
         </w:tc>
         <w:tc>
@@ -2780,6 +3198,13 @@
                 <w:lang w:eastAsia="en-US"/>
               </w:rPr>
             </w:pPr>
+            <w:r>
+              <w:rPr>
+                <w:rFonts w:eastAsia="Times New Roman" w:cs="Times New Roman"/>
+                <w:lang w:eastAsia="en-US"/>
+              </w:rPr>
+              <w:t>PostValidator, SystemRulesConfig, errorMessage</w:t>
+            </w:r>
           </w:p>
         </w:tc>
       </w:tr>
@@ -2792,9 +3217,20 @@
             <w:pPr>
               <w:rPr>
                 <w:rFonts w:eastAsia="Times New Roman" w:cs="Arial"/>
-                <w:lang w:eastAsia="en-US"/>
-              </w:rPr>
-            </w:pPr>
+                <w:b/>
+                <w:bCs/>
+                <w:lang w:eastAsia="en-US"/>
+              </w:rPr>
+            </w:pPr>
+            <w:r>
+              <w:rPr>
+                <w:rFonts w:eastAsia="Times New Roman" w:cs="Arial"/>
+                <w:b/>
+                <w:bCs/>
+                <w:lang w:eastAsia="en-US"/>
+              </w:rPr>
+              <w:t>Post Validator</w:t>
+            </w:r>
           </w:p>
         </w:tc>
         <w:tc>
@@ -2808,6 +3244,13 @@
                 <w:lang w:eastAsia="en-US"/>
               </w:rPr>
             </w:pPr>
+            <w:r>
+              <w:rPr>
+                <w:rFonts w:eastAsia="Times New Roman" w:cs="Arial"/>
+                <w:lang w:eastAsia="en-US"/>
+              </w:rPr>
+              <w:t>isValid</w:t>
+            </w:r>
           </w:p>
         </w:tc>
         <w:tc>
@@ -2821,6 +3264,13 @@
                 <w:lang w:eastAsia="en-US"/>
               </w:rPr>
             </w:pPr>
+            <w:r>
+              <w:rPr>
+                <w:rFonts w:eastAsia="Times New Roman" w:cs="Arial"/>
+                <w:lang w:eastAsia="en-US"/>
+              </w:rPr>
+              <w:t>Variable</w:t>
+            </w:r>
           </w:p>
         </w:tc>
         <w:tc>
@@ -2834,6 +3284,13 @@
                 <w:lang w:eastAsia="en-US"/>
               </w:rPr>
             </w:pPr>
+            <w:r>
+              <w:rPr>
+                <w:rFonts w:eastAsia="Times New Roman" w:cs="Arial"/>
+                <w:lang w:eastAsia="en-US"/>
+              </w:rPr>
+              <w:t>A boolean tracking if the job post is valid to be posted</w:t>
+            </w:r>
           </w:p>
         </w:tc>
         <w:tc>
@@ -2860,6 +3317,13 @@
                 <w:lang w:eastAsia="en-US"/>
               </w:rPr>
             </w:pPr>
+            <w:r>
+              <w:rPr>
+                <w:rFonts w:eastAsia="Times New Roman" w:cs="Times New Roman"/>
+                <w:lang w:eastAsia="en-US"/>
+              </w:rPr>
+              <w:t>ValidationResult</w:t>
+            </w:r>
           </w:p>
         </w:tc>
       </w:tr>
@@ -2873,9 +3337,20 @@
             <w:pPr>
               <w:rPr>
                 <w:rFonts w:eastAsia="Times New Roman" w:cs="Arial"/>
-                <w:lang w:eastAsia="en-US"/>
-              </w:rPr>
-            </w:pPr>
+                <w:b/>
+                <w:bCs/>
+                <w:lang w:eastAsia="en-US"/>
+              </w:rPr>
+            </w:pPr>
+            <w:r>
+              <w:rPr>
+                <w:rFonts w:eastAsia="Times New Roman" w:cs="Arial"/>
+                <w:b/>
+                <w:bCs/>
+                <w:lang w:eastAsia="en-US"/>
+              </w:rPr>
+              <w:t>Post Validator</w:t>
+            </w:r>
           </w:p>
         </w:tc>
         <w:tc>
@@ -2890,6 +3365,13 @@
                 <w:lang w:eastAsia="en-US"/>
               </w:rPr>
             </w:pPr>
+            <w:r>
+              <w:rPr>
+                <w:rFonts w:eastAsia="Times New Roman" w:cs="Arial"/>
+                <w:lang w:eastAsia="en-US"/>
+              </w:rPr>
+              <w:t>errorMessage</w:t>
+            </w:r>
           </w:p>
         </w:tc>
         <w:tc>
@@ -2904,6 +3386,13 @@
                 <w:lang w:eastAsia="en-US"/>
               </w:rPr>
             </w:pPr>
+            <w:r>
+              <w:rPr>
+                <w:rFonts w:eastAsia="Times New Roman" w:cs="Arial"/>
+                <w:lang w:eastAsia="en-US"/>
+              </w:rPr>
+              <w:t>Variable</w:t>
+            </w:r>
           </w:p>
         </w:tc>
         <w:tc>
@@ -2918,6 +3407,13 @@
                 <w:lang w:eastAsia="en-US"/>
               </w:rPr>
             </w:pPr>
+            <w:r>
+              <w:rPr>
+                <w:rFonts w:eastAsia="Times New Roman" w:cs="Arial"/>
+                <w:lang w:eastAsia="en-US"/>
+              </w:rPr>
+              <w:t>Notification to user when the validation check failed</w:t>
+            </w:r>
           </w:p>
         </w:tc>
         <w:tc>
@@ -2946,6 +3442,13 @@
                 <w:lang w:eastAsia="en-US"/>
               </w:rPr>
             </w:pPr>
+            <w:r>
+              <w:rPr>
+                <w:rFonts w:eastAsia="Times New Roman" w:cs="Times New Roman"/>
+                <w:lang w:eastAsia="en-US"/>
+              </w:rPr>
+              <w:t>ValidationResult</w:t>
+            </w:r>
           </w:p>
         </w:tc>
       </w:tr>
@@ -2958,9 +3461,20 @@
             <w:pPr>
               <w:rPr>
                 <w:rFonts w:eastAsia="Times New Roman" w:cs="Arial"/>
-                <w:lang w:eastAsia="en-US"/>
-              </w:rPr>
-            </w:pPr>
+                <w:b/>
+                <w:bCs/>
+                <w:lang w:eastAsia="en-US"/>
+              </w:rPr>
+            </w:pPr>
+            <w:r>
+              <w:rPr>
+                <w:rFonts w:eastAsia="Times New Roman" w:cs="Arial"/>
+                <w:b/>
+                <w:bCs/>
+                <w:lang w:eastAsia="en-US"/>
+              </w:rPr>
+              <w:t>Post Validator</w:t>
+            </w:r>
           </w:p>
         </w:tc>
         <w:tc>
@@ -2974,6 +3488,13 @@
                 <w:lang w:eastAsia="en-US"/>
               </w:rPr>
             </w:pPr>
+            <w:r>
+              <w:rPr>
+                <w:rFonts w:eastAsia="Times New Roman" w:cs="Arial"/>
+                <w:lang w:eastAsia="en-US"/>
+              </w:rPr>
+              <w:t>SystemRulesConfig</w:t>
+            </w:r>
           </w:p>
         </w:tc>
         <w:tc>
@@ -2987,6 +3508,13 @@
                 <w:lang w:eastAsia="en-US"/>
               </w:rPr>
             </w:pPr>
+            <w:r>
+              <w:rPr>
+                <w:rFonts w:eastAsia="Times New Roman" w:cs="Arial"/>
+                <w:lang w:eastAsia="en-US"/>
+              </w:rPr>
+              <w:t>Data Store</w:t>
+            </w:r>
           </w:p>
         </w:tc>
         <w:tc>
@@ -3000,6 +3528,13 @@
                 <w:lang w:eastAsia="en-US"/>
               </w:rPr>
             </w:pPr>
+            <w:r>
+              <w:rPr>
+                <w:rFonts w:eastAsia="Times New Roman" w:cs="Arial"/>
+                <w:lang w:eastAsia="en-US"/>
+              </w:rPr>
+              <w:t>A reference configuration file or directory tracking system constants and forbidden word lists.</w:t>
+            </w:r>
           </w:p>
         </w:tc>
         <w:tc>
@@ -3026,6 +3561,13 @@
                 <w:lang w:eastAsia="en-US"/>
               </w:rPr>
             </w:pPr>
+            <w:r>
+              <w:rPr>
+                <w:rFonts w:eastAsia="Times New Roman" w:cs="Times New Roman"/>
+                <w:lang w:eastAsia="en-US"/>
+              </w:rPr>
+              <w:t>checkProfanity</w:t>
+            </w:r>
           </w:p>
         </w:tc>
       </w:tr>
@@ -3550,7 +4092,6 @@
   <w:style w:type="character" w:default="1" w:styleId="DefaultParagraphFont">
     <w:name w:val="Default Paragraph Font"/>
     <w:uiPriority w:val="1"/>
-    <w:semiHidden/>
     <w:unhideWhenUsed/>
   </w:style>
   <w:style w:type="table" w:default="1" w:styleId="TableNormal">

</xml_diff>